<commit_message>
Draft_041: fix Research Process step b bold spill
Label only bold. Body matches steps a, c, d, e. PDF regenerated.
</commit_message>
<xml_diff>
--- a/thesis/003_ThesisProposal_Draft_041.docx
+++ b/thesis/003_ThesisProposal_Draft_041.docx
@@ -2574,29 +2574,29 @@
       </w:pPr>
       <w:r>
         <w:rPr>
-          <w:rFonts w:ascii="Georgia" w:cs="Georgia" w:eastAsia="Georgia" w:hAnsi="Georgia"/>
-          <w:b w:val="1"/>
-          <w:bCs w:val="1"/>
-          <w:i w:val="0"/>
-          <w:iCs w:val="0"/>
-          <w:sz w:val="22"/>
-          <w:szCs w:val="22"/>
-          <w:rtl w:val="0"/>
+          <w:rFonts w:ascii="Georgia" w:hAnsi="Georgia" w:cs="Georgia" w:eastAsia="Georgia"/>
+          <w:i w:val="0"/>
+          <w:iCs w:val="0"/>
+          <w:sz w:val="22"/>
+          <w:szCs w:val="22"/>
+          <w:rtl w:val="0"/>
+          <w:b/>
+          <w:bCs/>
         </w:rPr>
         <w:t xml:space="preserve">a. Requesting Permission. </w:t>
       </w:r>
       <w:r>
         <w:rPr>
-          <w:rFonts w:ascii="Georgia" w:cs="Georgia" w:eastAsia="Georgia" w:hAnsi="Georgia"/>
-          <w:b w:val="0"/>
-          <w:bCs w:val="0"/>
-          <w:i w:val="0"/>
-          <w:iCs w:val="0"/>
-          <w:sz w:val="22"/>
-          <w:szCs w:val="22"/>
-          <w:rtl w:val="0"/>
-        </w:rPr>
-        <w:t xml:space="preserve">The researcher secured written permission from the PSAU Library administration to access the physical archives of undergraduate theses. Due to institutional policies on intellectual property, soft copies of theses are restricted and cannot be provided electronically. Access is limited to on-site reading of hard-bound copies. The researcher obtained specific authorization to photograph the abstract sections of the selected theses for research purposes.</w:t>
+          <w:rFonts w:ascii="Georgia" w:hAnsi="Georgia" w:cs="Georgia" w:eastAsia="Georgia"/>
+          <w:i w:val="0"/>
+          <w:iCs w:val="0"/>
+          <w:sz w:val="22"/>
+          <w:szCs w:val="22"/>
+          <w:rtl w:val="0"/>
+          <w:b w:val="0"/>
+          <w:bCs w:val="0"/>
+        </w:rPr>
+        <w:t>The researcher secured written permission from the PSAU Library administration to access the physical archives of undergraduate theses. Due to institutional policies on intellectual property, soft copies of theses are restricted and cannot be provided electronically. Access is limited to on-site reading of hard-bound copies. The researcher obtained specific authorization to photograph the abstract sections of the selected theses for research purposes.</w:t>
       </w:r>
       <w:r>
         <w:rPr>
@@ -2613,28 +2613,29 @@
       </w:pPr>
       <w:r>
         <w:rPr>
-          <w:rFonts w:ascii="Georgia" w:cs="Georgia" w:eastAsia="Georgia" w:hAnsi="Georgia"/>
-          <w:b w:val="1"/>
-          <w:bCs w:val="1"/>
-          <w:i w:val="0"/>
-          <w:iCs w:val="0"/>
-          <w:sz w:val="22"/>
-          <w:szCs w:val="22"/>
-          <w:rtl w:val="0"/>
-        </w:rPr>
-        <w:t>b. Corpus Construction. Disproportionate stratified systematic sampling was used, with discipline as the stratification variable and fixed analytical targets per stratum to ensure equal representation regardless of population size. The target sample sizes were n=20 for Biology, n=20 for Veterinary Medicine, n=10 for Agriculture, Animal Science, and n=10 for Agriculture, Crop Science, totaling 60 abstracts. Within each stratum, a sampling interval k was calculated as k = N/n, where N is the stratum’s target pool size (theses completed 2023–2025) and n is the required sample size. The intervals were as follows: Biology k=7 (145÷20=7.25), Veterinary Medicine k=5 (104÷20=5.2), Animal Science k=4 (38÷10=3.8), and Crop Science k=9 (94÷10=9.4). Sampling began from a randomly selected position around the middle of each stratum’s catalog and proceeded forward by taking every kth thesis. Where the end of the stratum was reached before the required sample size, counting wrapped around to the beginning of the catalog and continued until the target sample was met. Disciplinary classification followed the degree program under which each thesis was officially submitted (e.g., B.S. Agriculture, B.S. Biology, D.V.M.), not research topic, to ensure objective categorization.</w:t>
-      </w:r>
-      <w:r>
-        <w:rPr>
-          <w:rFonts w:ascii="Georgia" w:cs="Georgia" w:eastAsia="Georgia" w:hAnsi="Georgia"/>
-          <w:b w:val="0"/>
-          <w:bCs w:val="0"/>
-          <w:i w:val="0"/>
-          <w:iCs w:val="0"/>
-          <w:sz w:val="22"/>
-          <w:szCs w:val="22"/>
-          <w:rtl w:val="0"/>
-        </w:rPr>
+          <w:rFonts w:ascii="Georgia" w:hAnsi="Georgia" w:cs="Georgia" w:eastAsia="Georgia"/>
+          <w:i w:val="0"/>
+          <w:iCs w:val="0"/>
+          <w:sz w:val="22"/>
+          <w:szCs w:val="22"/>
+          <w:rtl w:val="0"/>
+          <w:b/>
+          <w:bCs/>
+        </w:rPr>
+        <w:t xml:space="preserve">b. Corpus Construction. </w:t>
+      </w:r>
+      <w:r>
+        <w:rPr>
+          <w:rFonts w:ascii="Georgia" w:hAnsi="Georgia" w:cs="Georgia" w:eastAsia="Georgia"/>
+          <w:i w:val="0"/>
+          <w:iCs w:val="0"/>
+          <w:sz w:val="22"/>
+          <w:szCs w:val="22"/>
+          <w:rtl w:val="0"/>
+          <w:b w:val="0"/>
+          <w:bCs w:val="0"/>
+        </w:rPr>
+        <w:t>Disproportionate stratified systematic sampling was used, with discipline as the stratification variable and fixed analytical targets per stratum to ensure equal representation regardless of population size. The target sample sizes were n=20 for Biology, n=20 for Veterinary Medicine, n=10 for Agriculture, Animal Science, and n=10 for Agriculture, Crop Science, totaling 60 abstracts. Within each stratum, a sampling interval k was calculated as k = N/n, where N is the stratum’s target pool size (theses completed 2023–2025) and n is the required sample size. The intervals were as follows: Biology k=7 (145÷20=7.25), Veterinary Medicine k=5 (104÷20=5.2), Animal Science k=4 (38÷10=3.8), and Crop Science k=9 (94÷10=9.4). Sampling began from a randomly selected position around the middle of each stratum’s catalog and proceeded forward by taking every kth thesis. Where the end of the stratum was reached before the required sample size, counting wrapped around to the beginning of the catalog and continued until the target sample was met. Disciplinary classification followed the degree program under which each thesis was officially submitted (e.g., B.S. Agriculture, B.S. Biology, D.V.M.), not research topic, to ensure objective categorization.</w:t>
       </w:r>
       <w:r>
         <w:rPr>
@@ -2651,29 +2652,29 @@
       </w:pPr>
       <w:r>
         <w:rPr>
-          <w:rFonts w:ascii="Georgia" w:cs="Georgia" w:eastAsia="Georgia" w:hAnsi="Georgia"/>
-          <w:b w:val="1"/>
-          <w:bCs w:val="1"/>
-          <w:i w:val="0"/>
-          <w:iCs w:val="0"/>
-          <w:sz w:val="22"/>
-          <w:szCs w:val="22"/>
-          <w:rtl w:val="0"/>
+          <w:rFonts w:ascii="Georgia" w:hAnsi="Georgia" w:cs="Georgia" w:eastAsia="Georgia"/>
+          <w:i w:val="0"/>
+          <w:iCs w:val="0"/>
+          <w:sz w:val="22"/>
+          <w:szCs w:val="22"/>
+          <w:rtl w:val="0"/>
+          <w:b/>
+          <w:bCs/>
         </w:rPr>
         <w:t xml:space="preserve">c. Text Extraction. </w:t>
       </w:r>
       <w:r>
         <w:rPr>
-          <w:rFonts w:ascii="Georgia" w:cs="Georgia" w:eastAsia="Georgia" w:hAnsi="Georgia"/>
-          <w:b w:val="0"/>
-          <w:bCs w:val="0"/>
-          <w:i w:val="0"/>
-          <w:iCs w:val="0"/>
-          <w:sz w:val="22"/>
-          <w:szCs w:val="22"/>
-          <w:rtl w:val="0"/>
-        </w:rPr>
-        <w:t xml:space="preserve">Abstracts were captured through on-site photography of the hard-bound thesis copies. These images were then converted to plain text using Optical Character Recognition (OCR) tools such as Google Drive or Adobe Scan. Each converted text was manually verified against the original photographs to correct transcription errors. Particular attention was paid to verifying sentences containing potential hedge tokens, as OCR errors in these sentences would directly affect the coding results. Text files were anonymized using discipline codes (Acs1–Acs10, Aas1–Aas10, VM1–VM20, B1–B20) and organized by discipline.</w:t>
+          <w:rFonts w:ascii="Georgia" w:hAnsi="Georgia" w:cs="Georgia" w:eastAsia="Georgia"/>
+          <w:i w:val="0"/>
+          <w:iCs w:val="0"/>
+          <w:sz w:val="22"/>
+          <w:szCs w:val="22"/>
+          <w:rtl w:val="0"/>
+          <w:b w:val="0"/>
+          <w:bCs w:val="0"/>
+        </w:rPr>
+        <w:t>Abstracts were captured through on-site photography of the hard-bound thesis copies. These images were then converted to plain text using Optical Character Recognition (OCR) tools such as Google Drive or Adobe Scan. Each converted text was manually verified against the original photographs to correct transcription errors. Particular attention was paid to verifying sentences containing potential hedge tokens, as OCR errors in these sentences would directly affect the coding results. Text files were anonymized using discipline codes (Acs1–Acs10, Aas1–Aas10, VM1–VM20, B1–B20) and organized by discipline.</w:t>
       </w:r>
       <w:r>
         <w:rPr>
@@ -2690,27 +2691,27 @@
       </w:pPr>
       <w:r>
         <w:rPr>
-          <w:rFonts w:ascii="Georgia" w:cs="Georgia" w:eastAsia="Georgia" w:hAnsi="Georgia"/>
-          <w:b w:val="1"/>
-          <w:bCs w:val="1"/>
-          <w:i w:val="0"/>
-          <w:iCs w:val="0"/>
-          <w:sz w:val="22"/>
-          <w:szCs w:val="22"/>
-          <w:rtl w:val="0"/>
+          <w:rFonts w:ascii="Georgia" w:hAnsi="Georgia" w:cs="Georgia" w:eastAsia="Georgia"/>
+          <w:i w:val="0"/>
+          <w:iCs w:val="0"/>
+          <w:sz w:val="22"/>
+          <w:szCs w:val="22"/>
+          <w:rtl w:val="0"/>
+          <w:b/>
+          <w:bCs/>
         </w:rPr>
         <w:t xml:space="preserve">d. Pilot Testing and Reliability Checking. </w:t>
       </w:r>
       <w:r>
         <w:rPr>
-          <w:rFonts w:ascii="Georgia" w:cs="Georgia" w:eastAsia="Georgia" w:hAnsi="Georgia"/>
-          <w:b w:val="0"/>
-          <w:bCs w:val="0"/>
-          <w:i w:val="0"/>
-          <w:iCs w:val="0"/>
-          <w:sz w:val="22"/>
-          <w:szCs w:val="22"/>
-          <w:rtl w:val="0"/>
+          <w:rFonts w:ascii="Georgia" w:hAnsi="Georgia" w:cs="Georgia" w:eastAsia="Georgia"/>
+          <w:i w:val="0"/>
+          <w:iCs w:val="0"/>
+          <w:sz w:val="22"/>
+          <w:szCs w:val="22"/>
+          <w:rtl w:val="0"/>
+          <w:b w:val="0"/>
+          <w:bCs w:val="0"/>
         </w:rPr>
         <w:t>A pilot test was conducted on 4 abstracts not included in the final corpus to establish the overall coding scheme (see Appendix A). Decision rules for boundary cases were refined during main-corpus coding as specific ambiguities appeared and logged in the codebook. After the codebook was finalized, the full corpus was re-coded under the final rule set. The intra-rater reliability check (second pass on 6 abstracts) used that same final codebook. Pilot abstracts were drawn from the PSAU library archives but from theses whose hard-bound submission year was before 2023, keeping them outside the study’s inclusion window. To ensure reliability, the study employed a two-step verification process. First, intra-rater consistency was checked by double-coding approximately 10% of the corpus (6 abstracts, 2 per discipline) after a one-week interval, yielding 95% exact agreement (Cohen’s κ = 0.89, indicating almost perfect agreement per Landis &amp; Koch, 1977). Second, the coded data were reviewed by the thesis adviser to verify consistency and accuracy. This approach combined intra-rater reliability with adviser-supervised validation, which was the standard practice for single-researcher undergraduate projects. Discrepancies were resolved through discussion and consensus.</w:t>
       </w:r>
@@ -2729,27 +2730,27 @@
       </w:pPr>
       <w:r>
         <w:rPr>
-          <w:rFonts w:ascii="Georgia" w:cs="Georgia" w:eastAsia="Georgia" w:hAnsi="Georgia"/>
-          <w:b w:val="1"/>
-          <w:bCs w:val="1"/>
-          <w:i w:val="0"/>
-          <w:iCs w:val="0"/>
-          <w:sz w:val="22"/>
-          <w:szCs w:val="22"/>
-          <w:rtl w:val="0"/>
+          <w:rFonts w:ascii="Georgia" w:hAnsi="Georgia" w:cs="Georgia" w:eastAsia="Georgia"/>
+          <w:i w:val="0"/>
+          <w:iCs w:val="0"/>
+          <w:sz w:val="22"/>
+          <w:szCs w:val="22"/>
+          <w:rtl w:val="0"/>
+          <w:b/>
+          <w:bCs/>
         </w:rPr>
         <w:t xml:space="preserve">e. Data Analysis. </w:t>
       </w:r>
       <w:r>
         <w:rPr>
-          <w:rFonts w:ascii="Georgia" w:cs="Georgia" w:eastAsia="Georgia" w:hAnsi="Georgia"/>
-          <w:b w:val="0"/>
-          <w:bCs w:val="0"/>
-          <w:i w:val="0"/>
-          <w:iCs w:val="0"/>
-          <w:sz w:val="22"/>
-          <w:szCs w:val="22"/>
-          <w:rtl w:val="0"/>
+          <w:rFonts w:ascii="Georgia" w:hAnsi="Georgia" w:cs="Georgia" w:eastAsia="Georgia"/>
+          <w:i w:val="0"/>
+          <w:iCs w:val="0"/>
+          <w:sz w:val="22"/>
+          <w:szCs w:val="22"/>
+          <w:rtl w:val="0"/>
+          <w:b w:val="0"/>
+          <w:bCs w:val="0"/>
         </w:rPr>
         <w:t>Hedge identification, type classification, and functional coding were all conducted manually using a Google Sheets coding template. Each abstract was read in full before coding began to ensure hedges were interpreted in context rather than flagged as isolated tokens. Ambiguous cases were resolved using the predefined decision tree in Appendix A. Frequency counts were normalized per 100 words to enable comparison across abstracts of varying length. In a separate pass, each abstract was also coded for outcome type from its results language (Binary, Continuous, Mixed, Null/NS, Other), so that density patterns could be read against the kind of finding reported; those codes are recorded in the coding spreadsheet and discussed in Part IV. While the quantitative analysis identified what hedges were used, the qualitative interpretation applied Salager-Meyer’s (1994) claim-responsibility framework and Hyland’s (2005) stance model to explain why these patterns occurred. Given the corpus size, findings were interpreted as indicative patterns within the PSAU context, supplemented by exploratory inferential analyses (chi-square, Kruskal-Wallis) whose results are reported transparently but should not be treated as confirmatory given the small, zero-inflated sample.</w:t>
       </w:r>

</xml_diff>

<commit_message>
Draft_041: keep Table 3 label and heading with table body
Page break before caption so inventory is not split across pages.
</commit_message>
<xml_diff>
--- a/thesis/003_ThesisProposal_Draft_041.docx
+++ b/thesis/003_ThesisProposal_Draft_041.docx
@@ -5046,6 +5046,9 @@
       <w:pPr>
         <w:spacing w:before="240" w:after="0" w:line="480" w:lineRule="auto"/>
         <w:jc w:val="center"/>
+        <w:pageBreakBefore/>
+        <w:keepNext/>
+        <w:keepLines/>
       </w:pPr>
       <w:r>
         <w:rPr>
@@ -5061,6 +5064,8 @@
       <w:pPr>
         <w:spacing w:before="0" w:after="0" w:line="480" w:lineRule="auto"/>
         <w:jc w:val="center"/>
+        <w:keepNext/>
+        <w:keepLines/>
       </w:pPr>
       <w:r>
         <w:rPr>
@@ -5083,6 +5088,10 @@
         <w:gridCol w:w="2076"/>
       </w:tblGrid>
       <w:tr>
+        <w:trPr>
+          <w:cantSplit/>
+          <w:tblHeader/>
+        </w:trPr>
         <w:tc>
           <w:tcPr>
             <w:tcW w:type="dxa" w:w="2076"/>
@@ -5185,6 +5194,9 @@
         </w:tc>
       </w:tr>
       <w:tr>
+        <w:trPr>
+          <w:cantSplit/>
+        </w:trPr>
         <w:tc>
           <w:tcPr>
             <w:tcW w:type="dxa" w:w="2076"/>
@@ -5287,6 +5299,9 @@
         </w:tc>
       </w:tr>
       <w:tr>
+        <w:trPr>
+          <w:cantSplit/>
+        </w:trPr>
         <w:tc>
           <w:tcPr>
             <w:tcW w:type="dxa" w:w="2076"/>
@@ -5389,6 +5404,9 @@
         </w:tc>
       </w:tr>
       <w:tr>
+        <w:trPr>
+          <w:cantSplit/>
+        </w:trPr>
         <w:tc>
           <w:tcPr>
             <w:tcW w:type="dxa" w:w="2076"/>
@@ -5491,6 +5509,9 @@
         </w:tc>
       </w:tr>
       <w:tr>
+        <w:trPr>
+          <w:cantSplit/>
+        </w:trPr>
         <w:tc>
           <w:tcPr>
             <w:tcW w:type="dxa" w:w="2076"/>
@@ -5593,6 +5614,9 @@
         </w:tc>
       </w:tr>
       <w:tr>
+        <w:trPr>
+          <w:cantSplit/>
+        </w:trPr>
         <w:tc>
           <w:tcPr>
             <w:tcW w:type="dxa" w:w="2076"/>
@@ -5695,6 +5719,9 @@
         </w:tc>
       </w:tr>
       <w:tr>
+        <w:trPr>
+          <w:cantSplit/>
+        </w:trPr>
         <w:tc>
           <w:tcPr>
             <w:tcW w:type="dxa" w:w="2076"/>
@@ -5797,6 +5824,9 @@
         </w:tc>
       </w:tr>
       <w:tr>
+        <w:trPr>
+          <w:cantSplit/>
+        </w:trPr>
         <w:tc>
           <w:tcPr>
             <w:tcW w:type="dxa" w:w="2076"/>
@@ -5899,6 +5929,9 @@
         </w:tc>
       </w:tr>
       <w:tr>
+        <w:trPr>
+          <w:cantSplit/>
+        </w:trPr>
         <w:tc>
           <w:tcPr>
             <w:tcW w:type="dxa" w:w="2076"/>
@@ -6001,6 +6034,9 @@
         </w:tc>
       </w:tr>
       <w:tr>
+        <w:trPr>
+          <w:cantSplit/>
+        </w:trPr>
         <w:tc>
           <w:tcPr>
             <w:tcW w:type="dxa" w:w="2076"/>
@@ -6103,6 +6139,9 @@
         </w:tc>
       </w:tr>
       <w:tr>
+        <w:trPr>
+          <w:cantSplit/>
+        </w:trPr>
         <w:tc>
           <w:tcPr>
             <w:tcW w:type="dxa" w:w="2076"/>
@@ -6205,6 +6244,9 @@
         </w:tc>
       </w:tr>
       <w:tr>
+        <w:trPr>
+          <w:cantSplit/>
+        </w:trPr>
         <w:tc>
           <w:tcPr>
             <w:tcW w:type="dxa" w:w="2076"/>
@@ -6307,6 +6349,9 @@
         </w:tc>
       </w:tr>
       <w:tr>
+        <w:trPr>
+          <w:cantSplit/>
+        </w:trPr>
         <w:tc>
           <w:tcPr>
             <w:tcW w:type="dxa" w:w="2076"/>
@@ -6409,6 +6454,9 @@
         </w:tc>
       </w:tr>
       <w:tr>
+        <w:trPr>
+          <w:cantSplit/>
+        </w:trPr>
         <w:tc>
           <w:tcPr>
             <w:tcW w:type="dxa" w:w="2076"/>
@@ -6511,6 +6559,9 @@
         </w:tc>
       </w:tr>
       <w:tr>
+        <w:trPr>
+          <w:cantSplit/>
+        </w:trPr>
         <w:tc>
           <w:tcPr>
             <w:tcW w:type="dxa" w:w="2076"/>
@@ -6613,6 +6664,9 @@
         </w:tc>
       </w:tr>
       <w:tr>
+        <w:trPr>
+          <w:cantSplit/>
+        </w:trPr>
         <w:tc>
           <w:tcPr>
             <w:tcW w:type="dxa" w:w="2076"/>
@@ -6715,6 +6769,9 @@
         </w:tc>
       </w:tr>
       <w:tr>
+        <w:trPr>
+          <w:cantSplit/>
+        </w:trPr>
         <w:tc>
           <w:tcPr>
             <w:tcW w:type="dxa" w:w="2076"/>

</xml_diff>